<commit_message>
day 1 Introduction to Database and Diff between FMS and vs DBMS
</commit_message>
<xml_diff>
--- a/Day-1.docx
+++ b/Day-1.docx
@@ -8,16 +8,16 @@
         <w:rPr>
           <w:b/>
           <w:bCs/>
-          <w:sz w:val="28"/>
-          <w:szCs w:val="28"/>
+          <w:sz w:val="32"/>
+          <w:szCs w:val="32"/>
         </w:rPr>
       </w:pPr>
       <w:r>
         <w:rPr>
           <w:b/>
           <w:bCs/>
-          <w:sz w:val="28"/>
-          <w:szCs w:val="28"/>
+          <w:sz w:val="32"/>
+          <w:szCs w:val="32"/>
         </w:rPr>
         <w:t>Day-1</w:t>
       </w:r>
@@ -735,7 +735,7 @@
     <w:p>
       <w:r>
         <w:pict w14:anchorId="488FEA7D">
-          <v:rect id="_x0000_i1037" style="width:0;height:1.5pt" o:hralign="center" o:hrstd="t" o:hr="t" fillcolor="#a0a0a0" stroked="f"/>
+          <v:rect id="_x0000_i1025" style="width:0;height:1.5pt" o:hralign="center" o:hrstd="t" o:hr="t" fillcolor="#a0a0a0" stroked="f"/>
         </w:pict>
       </w:r>
     </w:p>
@@ -1544,7 +1544,7 @@
     <w:p>
       <w:r>
         <w:pict w14:anchorId="5423A410">
-          <v:rect id="_x0000_i1038" style="width:0;height:1.5pt" o:hralign="center" o:hrstd="t" o:hr="t" fillcolor="#a0a0a0" stroked="f"/>
+          <v:rect id="_x0000_i1026" style="width:0;height:1.5pt" o:hralign="center" o:hrstd="t" o:hr="t" fillcolor="#a0a0a0" stroked="f"/>
         </w:pict>
       </w:r>
     </w:p>
@@ -4407,6 +4407,7 @@
   <w:style w:type="character" w:default="1" w:styleId="DefaultParagraphFont">
     <w:name w:val="Default Paragraph Font"/>
     <w:uiPriority w:val="1"/>
+    <w:semiHidden/>
     <w:unhideWhenUsed/>
   </w:style>
   <w:style w:type="table" w:default="1" w:styleId="TableNormal">

</xml_diff>